<commit_message>
Organize coursework by assignment week
Move assignment figures and supporting files into week-specific folders, remove duplicate and demo files, and update notebook/report paths and READMEs.

Co-authored-by: Copilot <223556219+Copilot@users.noreply.github.com>
</commit_message>
<xml_diff>
--- a/week6assignment/Week6_Customer_Support_Intent_Classification_Report.docx
+++ b/week6assignment/Week6_Customer_Support_Intent_Classification_Report.docx
@@ -378,7 +378,7 @@
           </w:tcPr>
           <w:p>
             <w:r>
-              <w:t>0.9943</w:t>
+              <w:t>0.9938</w:t>
             </w:r>
           </w:p>
         </w:tc>
@@ -388,7 +388,7 @@
           </w:tcPr>
           <w:p>
             <w:r>
-              <w:t>0.9944</w:t>
+              <w:t>0.9938</w:t>
             </w:r>
           </w:p>
         </w:tc>
@@ -398,7 +398,7 @@
           </w:tcPr>
           <w:p>
             <w:r>
-              <w:t>0.9943</w:t>
+              <w:t>0.9938</w:t>
             </w:r>
           </w:p>
         </w:tc>
@@ -408,7 +408,7 @@
           </w:tcPr>
           <w:p>
             <w:r>
-              <w:t>0.9943</w:t>
+              <w:t>0.9938</w:t>
             </w:r>
           </w:p>
         </w:tc>
@@ -440,7 +440,7 @@
           </w:tcPr>
           <w:p>
             <w:r>
-              <w:t>0.9888</w:t>
+              <w:t>0.9906</w:t>
             </w:r>
           </w:p>
         </w:tc>
@@ -450,7 +450,7 @@
           </w:tcPr>
           <w:p>
             <w:r>
-              <w:t>0.9891</w:t>
+              <w:t>0.9907</w:t>
             </w:r>
           </w:p>
         </w:tc>
@@ -460,7 +460,7 @@
           </w:tcPr>
           <w:p>
             <w:r>
-              <w:t>0.9888</w:t>
+              <w:t>0.9906</w:t>
             </w:r>
           </w:p>
         </w:tc>
@@ -470,7 +470,7 @@
           </w:tcPr>
           <w:p>
             <w:r>
-              <w:t>0.9889</w:t>
+              <w:t>0.9906</w:t>
             </w:r>
           </w:p>
         </w:tc>
@@ -498,7 +498,7 @@
       <w:r>
         <w:drawing>
           <wp:inline xmlns:a="http://schemas.openxmlformats.org/drawingml/2006/main" xmlns:pic="http://schemas.openxmlformats.org/drawingml/2006/picture">
-            <wp:extent cx="5760720" cy="2553593"/>
+            <wp:extent cx="5760720" cy="2535862"/>
             <wp:docPr id="1" name="Picture 1"/>
             <wp:cNvGraphicFramePr>
               <a:graphicFrameLocks noChangeAspect="1"/>
@@ -519,7 +519,7 @@
                   <pic:spPr>
                     <a:xfrm>
                       <a:off x="0" y="0"/>
-                      <a:ext cx="5760720" cy="2553593"/>
+                      <a:ext cx="5760720" cy="2535862"/>
                     </a:xfrm>
                     <a:prstGeom prst="rect"/>
                   </pic:spPr>
@@ -542,7 +542,7 @@
       <w:r>
         <w:drawing>
           <wp:inline xmlns:a="http://schemas.openxmlformats.org/drawingml/2006/main" xmlns:pic="http://schemas.openxmlformats.org/drawingml/2006/picture">
-            <wp:extent cx="5760720" cy="4297230"/>
+            <wp:extent cx="5760720" cy="4285068"/>
             <wp:docPr id="2" name="Picture 2"/>
             <wp:cNvGraphicFramePr>
               <a:graphicFrameLocks noChangeAspect="1"/>
@@ -563,7 +563,7 @@
                   <pic:spPr>
                     <a:xfrm>
                       <a:off x="0" y="0"/>
-                      <a:ext cx="5760720" cy="4297230"/>
+                      <a:ext cx="5760720" cy="4285068"/>
                     </a:xfrm>
                     <a:prstGeom prst="rect"/>
                   </pic:spPr>
@@ -586,7 +586,7 @@
       <w:r>
         <w:drawing>
           <wp:inline xmlns:a="http://schemas.openxmlformats.org/drawingml/2006/main" xmlns:pic="http://schemas.openxmlformats.org/drawingml/2006/picture">
-            <wp:extent cx="5760720" cy="1883468"/>
+            <wp:extent cx="5760720" cy="1875396"/>
             <wp:docPr id="3" name="Picture 3"/>
             <wp:cNvGraphicFramePr>
               <a:graphicFrameLocks noChangeAspect="1"/>
@@ -607,7 +607,7 @@
                   <pic:spPr>
                     <a:xfrm>
                       <a:off x="0" y="0"/>
-                      <a:ext cx="5760720" cy="1883468"/>
+                      <a:ext cx="5760720" cy="1875396"/>
                     </a:xfrm>
                     <a:prstGeom prst="rect"/>
                   </pic:spPr>
@@ -706,7 +706,7 @@
     </w:p>
     <w:p>
       <w:r>
-        <w:t>The MLP achieved the higher held-out macro F1 (0.9943); the difference between models was 0.0054. Consider precision/recall trade-offs and the per-intent confusion matrices before selecting a routing model. The baseline helps show whether either neural model is useful beyond predicting the most common class.</w:t>
+        <w:t>The MLP achieved the higher held-out macro F1 (0.9938); the difference between models was 0.0032. Consider precision/recall trade-offs and the per-intent confusion matrices before selecting a routing model. The baseline helps show whether either neural model is useful beyond predicting the most common class.</w:t>
       </w:r>
     </w:p>
     <w:p>

</xml_diff>